<commit_message>
Add cover page to The Conversation Before The Conversation master book
Prepends a typographic cover page matching the provided design:
tagline, THE CONVERSATION / BEFORE / THE CONVERSATION in navy/amber,
subtitle, and navy footer bar with MILAN J. NOLLINN.

Co-Authored-By: Claude Sonnet 4.6 <noreply@anthropic.com>
Claude-Session: https://claude.ai/code/session_01PffX3K6JYWvmU184qmZkA5
</commit_message>
<xml_diff>
--- a/THE_CONVERSATION_BEFORE_THE_CONVERSATION_MASTER_BOOK.docx
+++ b/THE_CONVERSATION_BEFORE_THE_CONVERSATION_MASTER_BOOK.docx
@@ -2,6 +2,217 @@
 <file path=word/document.xml><?xml version="1.0" encoding="utf-8"?>
 <w:document xmlns:wpc="http://schemas.microsoft.com/office/word/2010/wordprocessingCanvas" xmlns:cx="http://schemas.microsoft.com/office/drawing/2014/chartex" xmlns:cx1="http://schemas.microsoft.com/office/drawing/2015/9/8/chartex" xmlns:cx2="http://schemas.microsoft.com/office/drawing/2015/10/21/chartex" xmlns:cx3="http://schemas.microsoft.com/office/drawing/2016/5/9/chartex" xmlns:cx4="http://schemas.microsoft.com/office/drawing/2016/5/10/chartex" xmlns:cx5="http://schemas.microsoft.com/office/drawing/2016/5/11/chartex" xmlns:cx6="http://schemas.microsoft.com/office/drawing/2016/5/12/chartex" xmlns:cx7="http://schemas.microsoft.com/office/drawing/2016/5/13/chartex" xmlns:cx8="http://schemas.microsoft.com/office/drawing/2016/5/14/chartex" xmlns:mc="http://schemas.openxmlformats.org/markup-compatibility/2006" xmlns:aink="http://schemas.microsoft.com/office/drawing/2016/ink" xmlns:am3d="http://schemas.microsoft.com/office/drawing/2017/model3d" xmlns:o="urn:schemas-microsoft-com:office:office" xmlns:oel="http://schemas.microsoft.com/office/2019/extlst" xmlns:r="http://schemas.openxmlformats.org/officeDocument/2006/relationships" xmlns:m="http://schemas.openxmlformats.org/officeDocument/2006/math" xmlns:v="urn:schemas-microsoft-com:vml" xmlns:wp14="http://schemas.microsoft.com/office/word/2010/wordprocessingDrawing" xmlns:wp="http://schemas.openxmlformats.org/drawingml/2006/wordprocessingDrawing" xmlns:w10="urn:schemas-microsoft-com:office:word" xmlns:w="http://schemas.openxmlformats.org/wordprocessingml/2006/main" xmlns:w14="http://schemas.microsoft.com/office/word/2010/wordml" xmlns:w15="http://schemas.microsoft.com/office/word/2012/wordml" xmlns:w16cex="http://schemas.microsoft.com/office/word/2018/wordml/cex" xmlns:w16cid="http://schemas.microsoft.com/office/word/2016/wordml/cid" xmlns:w16="http://schemas.microsoft.com/office/word/2018/wordml" xmlns:w16du="http://schemas.microsoft.com/office/word/2023/wordml/word16du" xmlns:w16sdtdh="http://schemas.microsoft.com/office/word/2020/wordml/sdtdatahash" xmlns:w16sdtfl="http://schemas.microsoft.com/office/word/2024/wordml/sdtformatlock" xmlns:w16se="http://schemas.microsoft.com/office/word/2015/wordml/symex" xmlns:wpg="http://schemas.microsoft.com/office/word/2010/wordprocessingGroup" xmlns:wpi="http://schemas.microsoft.com/office/word/2010/wordprocessingInk" xmlns:wne="http://schemas.microsoft.com/office/word/2006/wordml" xmlns:wps="http://schemas.microsoft.com/office/word/2010/wordprocessingShape" mc:Ignorable="w14 w15 w16se w16cid w16 w16cex w16sdtdh w16sdtfl w16du wp14">
   <w:body>
+    <w:p>
+      <w:pPr>
+        <w:spacing w:before="320" w:after="160"/>
+        <w:jc w:val="center"/>
+      </w:pPr>
+      <w:r>
+        <w:rPr>
+          <w:rFonts w:ascii="Georgia" w:hAnsi="Georgia"/>
+          <w:b w:val="0"/>
+          <w:i w:val="0"/>
+          <w:color w:val="887766"/>
+          <w:sz w:val="14"/>
+        </w:rPr>
+        <w:t>A PRACTICAL TOOLBOX FOR DIFFICULT CONVERSATIONS</w:t>
+      </w:r>
+    </w:p>
+    <w:p>
+      <w:pPr>
+        <w:spacing w:before="80" w:after="80"/>
+        <w:jc w:val="center"/>
+        <w:pBdr>
+          <w:bottom w:val="single" w:sz="4" w:space="1" w:color="B57B2A"/>
+        </w:pBdr>
+      </w:pPr>
+    </w:p>
+    <w:p>
+      <w:pPr>
+        <w:spacing w:before="120" w:after="0"/>
+        <w:jc w:val="center"/>
+      </w:pPr>
+      <w:r>
+        <w:rPr>
+          <w:rFonts w:ascii="Georgia" w:hAnsi="Georgia"/>
+          <w:b/>
+          <w:i w:val="0"/>
+          <w:color w:val="101D3A"/>
+          <w:sz w:val="104"/>
+        </w:rPr>
+        <w:t>THE</w:t>
+      </w:r>
+    </w:p>
+    <w:p>
+      <w:pPr>
+        <w:spacing w:before="0" w:after="0"/>
+        <w:jc w:val="center"/>
+      </w:pPr>
+      <w:r>
+        <w:rPr>
+          <w:rFonts w:ascii="Georgia" w:hAnsi="Georgia"/>
+          <w:b/>
+          <w:i w:val="0"/>
+          <w:color w:val="101D3A"/>
+          <w:sz w:val="104"/>
+        </w:rPr>
+        <w:t>CONVERSATION</w:t>
+      </w:r>
+    </w:p>
+    <w:p>
+      <w:pPr>
+        <w:spacing w:before="80" w:after="80"/>
+        <w:jc w:val="center"/>
+        <w:pBdr>
+          <w:bottom w:val="single" w:sz="4" w:space="1" w:color="B57B2A"/>
+        </w:pBdr>
+      </w:pPr>
+    </w:p>
+    <w:p>
+      <w:pPr>
+        <w:spacing w:before="80" w:after="80"/>
+        <w:jc w:val="center"/>
+      </w:pPr>
+      <w:r>
+        <w:rPr>
+          <w:rFonts w:ascii="Georgia" w:hAnsi="Georgia"/>
+          <w:b/>
+          <w:i w:val="0"/>
+          <w:color w:val="B57B2A"/>
+          <w:sz w:val="104"/>
+        </w:rPr>
+        <w:t>BEFORE</w:t>
+      </w:r>
+    </w:p>
+    <w:p>
+      <w:pPr>
+        <w:spacing w:before="80" w:after="80"/>
+        <w:jc w:val="center"/>
+        <w:pBdr>
+          <w:bottom w:val="single" w:sz="4" w:space="1" w:color="B57B2A"/>
+        </w:pBdr>
+      </w:pPr>
+    </w:p>
+    <w:p>
+      <w:pPr>
+        <w:spacing w:before="80" w:after="0"/>
+        <w:jc w:val="center"/>
+      </w:pPr>
+      <w:r>
+        <w:rPr>
+          <w:rFonts w:ascii="Georgia" w:hAnsi="Georgia"/>
+          <w:b/>
+          <w:i w:val="0"/>
+          <w:color w:val="101D3A"/>
+          <w:sz w:val="104"/>
+        </w:rPr>
+        <w:t>THE</w:t>
+      </w:r>
+    </w:p>
+    <w:p>
+      <w:pPr>
+        <w:spacing w:before="0" w:after="240"/>
+        <w:jc w:val="center"/>
+      </w:pPr>
+      <w:r>
+        <w:rPr>
+          <w:rFonts w:ascii="Georgia" w:hAnsi="Georgia"/>
+          <w:b/>
+          <w:i w:val="0"/>
+          <w:color w:val="101D3A"/>
+          <w:sz w:val="104"/>
+        </w:rPr>
+        <w:t>CONVERSATION</w:t>
+      </w:r>
+    </w:p>
+    <w:p>
+      <w:pPr>
+        <w:spacing w:before="200" w:after="200"/>
+        <w:jc w:val="center"/>
+      </w:pPr>
+      <w:r>
+        <w:rPr>
+          <w:rFonts w:ascii="Georgia" w:hAnsi="Georgia"/>
+          <w:color w:val="101D3A"/>
+          <w:sz w:val="24"/>
+        </w:rPr>
+        <w:t>A step-by-step process to help you</w:t>
+        <w:br/>
+        <w:t>approach important conversations</w:t>
+        <w:br/>
+        <w:t xml:space="preserve">with </w:t>
+      </w:r>
+      <w:r>
+        <w:rPr>
+          <w:rFonts w:ascii="Georgia" w:hAnsi="Georgia"/>
+          <w:b w:val="0"/>
+          <w:color w:val="B57B2A"/>
+          <w:sz w:val="24"/>
+        </w:rPr>
+        <w:t>confidence, clarity, and control.</w:t>
+      </w:r>
+    </w:p>
+    <w:p>
+      <w:pPr>
+        <w:spacing w:before="1200" w:after="0"/>
+        <w:jc w:val="center"/>
+      </w:pPr>
+      <w:r>
+        <w:rPr>
+          <w:rFonts w:ascii="Georgia" w:hAnsi="Georgia"/>
+          <w:b w:val="0"/>
+          <w:i w:val="0"/>
+          <w:color w:val="101D3A"/>
+          <w:sz w:val="60"/>
+        </w:rPr>
+      </w:r>
+    </w:p>
+    <w:tbl>
+      <w:tblPr>
+        <w:tblStyle w:val="TableGrid"/>
+        <w:tblW w:type="auto" w:w="0"/>
+        <w:tblLook w:firstColumn="1" w:firstRow="1" w:lastColumn="0" w:lastRow="0" w:noHBand="0" w:noVBand="1" w:val="04A0"/>
+      </w:tblPr>
+      <w:tblGrid>
+        <w:gridCol w:w="7200"/>
+      </w:tblGrid>
+      <w:tr>
+        <w:tc>
+          <w:tcPr>
+            <w:tcW w:type="dxa" w:w="7200"/>
+            <w:shd w:val="clear" w:color="auto" w:fill="101D3A"/>
+            <w:tcBorders>
+              <w:top w:val="none"/>
+              <w:left w:val="none"/>
+              <w:bottom w:val="none"/>
+              <w:right w:val="none"/>
+              <w:insideH w:val="none"/>
+              <w:insideV w:val="none"/>
+            </w:tcBorders>
+          </w:tcPr>
+          <w:p>
+            <w:pPr>
+              <w:spacing w:before="280" w:after="280"/>
+              <w:jc w:val="center"/>
+            </w:pPr>
+            <w:r>
+              <w:rPr>
+                <w:rFonts w:ascii="Georgia" w:hAnsi="Georgia"/>
+                <w:b/>
+                <w:color w:val="FFFFFF"/>
+                <w:sz w:val="32"/>
+              </w:rPr>
+              <w:t>MILAN J. NOLLINN</w:t>
+            </w:r>
+          </w:p>
+        </w:tc>
+      </w:tr>
+    </w:tbl>
+    <w:p>
+      <w:r>
+        <w:br w:type="page"/>
+      </w:r>
+    </w:p>
     <w:p>
       <w:pPr>
         <w:spacing w:before="1440"/>

</xml_diff>